<commit_message>
Add Martabe WIs batch 12 (ReCYN caustic strength, analyser filter sock)
Co-Authored-By: Claude Sonnet 5.5 <noreply@anthropic.com>
Claude-Session: https://claude.ai/code/session_0121qocWgsZdFAsne2oz9sHT
</commit_message>
<xml_diff>
--- a/SWI/201-Plant-Sampling/MM-4034-033-OR-03-SWI-PRO-MET-201-020-Reagent-Solution-Strength-Sampling---NaCN-NaOH-H2SO4-NaCl-Lime-and-RevA.docx
+++ b/SWI/201-Plant-Sampling/MM-4034-033-OR-03-SWI-PRO-MET-201-020-Reagent-Solution-Strength-Sampling---NaCN-NaOH-H2SO4-NaCl-Lime-and-RevA.docx
@@ -638,7 +638,7 @@
                 <w:sz w:val="17"/>
                 <w:szCs w:val="17"/>
               </w:rPr>
-              <w:t xml:space="preserve">DRAFT FOR REVIEW. Martabe work instructions 'Sampling Feed, Product and Final Product of Lime Slaker' (DOC-3-MET-PRS-WIN-00059-IE) as Part B and 'Sampling Hydrated Lime' (DOC-3-MET-PRS-WIN-00061-IE) as Part C added to Section 6, both v1.0 issued 25/12/2024. Not approved until reviewed. JSEA JSEA-PRO-MET-201-020 must be updated for the added hazard row.</w:t>
+              <w:t xml:space="preserve">DRAFT FOR REVIEW. Martabe work instructions 'Sampling Feed, Product and Final Product of Lime Slaker' (DOC-3-MET-PRS-WIN-00059-IE) as Part B, 'Sampling Hydrated Lime' (DOC-3-MET-PRS-WIN-00061-IE) as Part C and 'ReCYN Plant Caustic Strength Measurement' (DOC-3-MET-PMC-WIN-00088-IE) as Part D added to Section 6, all v1.0 issued 25/12/2024. Not approved until reviewed. JSEA JSEA-PRO-MET-201-020 must be updated for the added hazard rows.</w:t>
             </w:r>
           </w:p>
         </w:tc>
@@ -1949,6 +1949,58 @@
           </w:p>
         </w:tc>
       </w:tr>
+      <w:tr>
+        <w:tc>
+          <w:tcPr>
+            <w:tcW w:type="dxa" w:w="2900"/>
+            <w:shd w:val="clear" w:color="auto" w:fill="F2F5FA"/>
+            <w:tcMar>
+              <w:top w:type="dxa" w:w="55"/>
+              <w:left w:type="dxa" w:w="85"/>
+              <w:bottom w:type="dxa" w:w="55"/>
+              <w:right w:type="dxa" w:w="85"/>
+            </w:tcMar>
+          </w:tcPr>
+          <w:p>
+            <w:pPr>
+              <w:spacing w:after="0" w:line="235"/>
+            </w:pPr>
+            <w:r>
+              <w:rPr>
+                <w:rFonts w:ascii="Calibri" w:cs="Calibri" w:eastAsia="Calibri" w:hAnsi="Calibri"/>
+                <w:sz w:val="16"/>
+                <w:szCs w:val="16"/>
+              </w:rPr>
+              <w:t xml:space="preserve">[JSEA to confirm] Spilled caustic and sulphuric acid, and contact with the fumes, at the ReCYN caustic sample point and bench</w:t>
+            </w:r>
+          </w:p>
+        </w:tc>
+        <w:tc>
+          <w:tcPr>
+            <w:tcW w:type="dxa" w:w="6126"/>
+            <w:shd w:val="clear" w:color="auto" w:fill="F2F5FA"/>
+            <w:tcMar>
+              <w:top w:type="dxa" w:w="55"/>
+              <w:left w:type="dxa" w:w="85"/>
+              <w:bottom w:type="dxa" w:w="55"/>
+              <w:right w:type="dxa" w:w="85"/>
+            </w:tcMar>
+          </w:tcPr>
+          <w:p>
+            <w:pPr>
+              <w:spacing w:after="0" w:line="235"/>
+            </w:pPr>
+            <w:r>
+              <w:rPr>
+                <w:rFonts w:ascii="Calibri" w:cs="Calibri" w:eastAsia="Calibri" w:hAnsi="Calibri"/>
+                <w:sz w:val="16"/>
+                <w:szCs w:val="16"/>
+              </w:rPr>
+              <w:t xml:space="preserve">Nitrile gloves, goggles and safety boots. Carry reagents in closed bottles or glassware. Safety data sheets read; eyewash proven flowing; wash contact under running water and soap. Titrate only in a working fume cupboard; close the sample bottle tightly after sampling.</w:t>
+            </w:r>
+          </w:p>
+        </w:tc>
+      </w:tr>
     </w:tbl>
     <w:p>
       <w:pPr>
@@ -2554,6 +2606,24 @@
     </w:p>
     <w:p>
       <w:pPr>
+        <w:pStyle w:val="ListParagraph"/>
+        <w:numPr>
+          <w:ilvl w:val="0"/>
+          <w:numId w:val="1"/>
+        </w:numPr>
+        <w:spacing w:after="60" w:line="245"/>
+      </w:pPr>
+      <w:r>
+        <w:rPr>
+          <w:rFonts w:ascii="Calibri" w:cs="Calibri" w:eastAsia="Calibri" w:hAnsi="Calibri"/>
+          <w:sz w:val="17"/>
+          <w:szCs w:val="17"/>
+        </w:rPr>
+        <w:t xml:space="preserve">[M] 100 mL sample bottle with a closing lid, fume cupboard, sulphuric acid solution prepared per the Martabe instruction (not received)</w:t>
+      </w:r>
+    </w:p>
+    <w:p>
+      <w:pPr>
         <w:pStyle w:val="Heading1"/>
         <w:spacing w:after="120" w:before="260"/>
       </w:pPr>
@@ -3141,6 +3211,132 @@
     </w:p>
     <w:p>
       <w:pPr>
+        <w:spacing w:after="90" w:before="180" w:line="245"/>
+        <w:keepNext/>
+      </w:pPr>
+      <w:r>
+        <w:rPr>
+          <w:rFonts w:ascii="Calibri" w:cs="Calibri" w:eastAsia="Calibri" w:hAnsi="Calibri"/>
+          <w:b/>
+          <w:bCs/>
+          <w:color w:val="1F3864"/>
+          <w:sz w:val="19"/>
+          <w:szCs w:val="19"/>
+        </w:rPr>
+        <w:t xml:space="preserve">Part D - ReCYN plant caustic: sampling and strength calculation [M]</w:t>
+      </w:r>
+    </w:p>
+    <w:p>
+      <w:pPr>
+        <w:spacing w:after="60" w:before="0" w:line="245"/>
+      </w:pPr>
+      <w:r>
+        <w:rPr>
+          <w:rFonts w:ascii="Calibri" w:cs="Calibri" w:eastAsia="Calibri" w:hAnsi="Calibri"/>
+          <w:sz w:val="17"/>
+          <w:szCs w:val="17"/>
+        </w:rPr>
+        <w:t xml:space="preserve">[M] = taken from the Martabe team work instruction "Recyn Plant Caustic Strength Measurement (DOC-3-MET-PMC-WIN-00088-IE)" (25/12/2024). [CONFIRM] = unspecified or inconsistent in the source; resolve before this instruction is approved for use. Parts A, B and C are unchanged.</w:t>
+      </w:r>
+    </w:p>
+    <w:p>
+      <w:pPr>
+        <w:ind w:left="280"/>
+        <w:spacing w:after="50" w:before="0" w:line="245"/>
+      </w:pPr>
+      <w:r>
+        <w:rPr>
+          <w:rFonts w:ascii="Calibri" w:cs="Calibri" w:eastAsia="Calibri" w:hAnsi="Calibri"/>
+          <w:b/>
+          <w:bCs/>
+          <w:sz w:val="17"/>
+          <w:szCs w:val="17"/>
+        </w:rPr>
+        <w:t xml:space="preserve">21.</w:t>
+      </w:r>
+      <w:r>
+        <w:rPr>
+          <w:rFonts w:ascii="Calibri" w:cs="Calibri" w:eastAsia="Calibri" w:hAnsi="Calibri"/>
+          <w:sz w:val="17"/>
+          <w:szCs w:val="17"/>
+        </w:rPr>
+        <w:t xml:space="preserve">  Take 5 and prepare the fume cupboard, beakers, 100 mL sample bottle, dropper and burette. Check them and the reagents (water, NaOH, phenolphthalein, sulphuric acid) are good to use [M].</w:t>
+      </w:r>
+    </w:p>
+    <w:p>
+      <w:pPr>
+        <w:ind w:left="280"/>
+        <w:spacing w:after="50" w:before="0" w:line="245"/>
+      </w:pPr>
+      <w:r>
+        <w:rPr>
+          <w:rFonts w:ascii="Calibri" w:cs="Calibri" w:eastAsia="Calibri" w:hAnsi="Calibri"/>
+          <w:b/>
+          <w:bCs/>
+          <w:sz w:val="17"/>
+          <w:szCs w:val="17"/>
+        </w:rPr>
+        <w:t xml:space="preserve">22.</w:t>
+      </w:r>
+      <w:r>
+        <w:rPr>
+          <w:rFonts w:ascii="Calibri" w:cs="Calibri" w:eastAsia="Calibri" w:hAnsi="Calibri"/>
+          <w:sz w:val="17"/>
+          <w:szCs w:val="17"/>
+        </w:rPr>
+        <w:t xml:space="preserve">  Take the NaOH sample from the drain pipe of the ReCYN plant caustic pump into the 100 mL bottle. Fill the bottle to the level of the lid so it does not overflow, then close it tightly. [CONFIRM] Part A step 5 says to sample only from the designated diluted-solution valve, never from the concentrated tank; confirm the pump drain pipe carries the diluted solution.</w:t>
+      </w:r>
+    </w:p>
+    <w:p>
+      <w:pPr>
+        <w:ind w:left="280"/>
+        <w:spacing w:after="50" w:before="0" w:line="245"/>
+      </w:pPr>
+      <w:r>
+        <w:rPr>
+          <w:rFonts w:ascii="Calibri" w:cs="Calibri" w:eastAsia="Calibri" w:hAnsi="Calibri"/>
+          <w:b/>
+          <w:bCs/>
+          <w:sz w:val="17"/>
+          <w:szCs w:val="17"/>
+        </w:rPr>
+        <w:t xml:space="preserve">23.</w:t>
+      </w:r>
+      <w:r>
+        <w:rPr>
+          <w:rFonts w:ascii="Calibri" w:cs="Calibri" w:eastAsia="Calibri" w:hAnsi="Calibri"/>
+          <w:sz w:val="17"/>
+          <w:szCs w:val="17"/>
+        </w:rPr>
+        <w:t xml:space="preserve">  Prepare the sulphuric acid and titrate the sample in the fume cupboard as SWI-PRO-MET-205-002 Part B describes.</w:t>
+      </w:r>
+    </w:p>
+    <w:p>
+      <w:pPr>
+        <w:ind w:left="280"/>
+        <w:spacing w:after="50" w:before="0" w:line="245"/>
+      </w:pPr>
+      <w:r>
+        <w:rPr>
+          <w:rFonts w:ascii="Calibri" w:cs="Calibri" w:eastAsia="Calibri" w:hAnsi="Calibri"/>
+          <w:b/>
+          <w:bCs/>
+          <w:sz w:val="17"/>
+          <w:szCs w:val="17"/>
+        </w:rPr>
+        <w:t xml:space="preserve">24.</w:t>
+      </w:r>
+      <w:r>
+        <w:rPr>
+          <w:rFonts w:ascii="Calibri" w:cs="Calibri" w:eastAsia="Calibri" w:hAnsi="Calibri"/>
+          <w:sz w:val="17"/>
+          <w:szCs w:val="17"/>
+        </w:rPr>
+        <w:t xml:space="preserve">  Record the caustic strength in 'G:\Processing\5. Metallurgy\Metallurgy Lab\04 Metlab Data\Concentrasi NaOH' or on form DOC-4-MET-PMC-DFR-00135-EN (Form Caustic Strength.xlsx).</w:t>
+      </w:r>
+    </w:p>
+    <w:p>
+      <w:pPr>
         <w:pStyle w:val="Heading1"/>
         <w:spacing w:after="120" w:before="260"/>
       </w:pPr>
@@ -3476,6 +3672,24 @@
           <w:szCs w:val="17"/>
         </w:rPr>
         <w:t xml:space="preserve">Martabe work instruction 'Sampling Hydrated Lime' DOC-3-MET-PRS-WIN-00061-IE v1.0 (issued 25/12/2024) - Part C source</w:t>
+      </w:r>
+    </w:p>
+    <w:p>
+      <w:pPr>
+        <w:pStyle w:val="ListParagraph"/>
+        <w:numPr>
+          <w:ilvl w:val="0"/>
+          <w:numId w:val="1"/>
+        </w:numPr>
+        <w:spacing w:after="60" w:line="245"/>
+      </w:pPr>
+      <w:r>
+        <w:rPr>
+          <w:rFonts w:ascii="Calibri" w:cs="Calibri" w:eastAsia="Calibri" w:hAnsi="Calibri"/>
+          <w:sz w:val="17"/>
+          <w:szCs w:val="17"/>
+        </w:rPr>
+        <w:t xml:space="preserve">Martabe work instruction 'ReCYN Plant Caustic Strength Measurement' DOC-3-MET-PMC-WIN-00088-IE v1.0 (issued 25/12/2024) - Part D source</w:t>
       </w:r>
     </w:p>
     <w:sectPr>

</xml_diff>